<commit_message>
Week 1: both lecture decks, shared beamer preamble, teaching notes
- shared/ee414-beamer-preamble.tex: palette, terminal-window code rule,
  underhood/inthefield asides, \rosver pinning the distribution in one place
- W01A Course Overview, 30 slides
- W01B What Is a Robot?, 30 slides
- week01/README.md: teaching notes, consistency checks, critical path
- reconcile spec and READMEs with the two-1.5h-sessions-per-week format

Co-Authored-By: Claude Opus 5 (1M context) <noreply@anthropic.com>
</commit_message>
<xml_diff>
--- a/01-course-specification/ee414-course-specification-fall2026.docx
+++ b/01-course-specification/ee414-course-specification-fall2026.docx
@@ -257,7 +257,7 @@
         <w:pStyle w:val="BodyText"/>
       </w:pPr>
       <w:r>
-        <w:t xml:space="preserve">Each 3-hour week is delivered as</w:t>
+        <w:t xml:space="preserve">Each week is delivered as</w:t>
       </w:r>
       <w:r>
         <w:t xml:space="preserve"> </w:t>
@@ -267,22 +267,60 @@
           <w:b/>
           <w:bCs/>
         </w:rPr>
-        <w:t xml:space="preserve">2 hours of lecture + 1 hour of in-class ROS 2 practice</w:t>
-      </w:r>
-      <w:r>
-        <w:t xml:space="preserve">,</w:t>
+        <w:t xml:space="preserve">two 1.5-hour sessions</w:t>
+      </w:r>
+      <w:r>
+        <w:t xml:space="preserve">. Session</w:t>
       </w:r>
       <w:r>
         <w:t xml:space="preserve"> </w:t>
       </w:r>
       <w:r>
-        <w:t xml:space="preserve">conducted in a computer-equipped classroom (or on student laptops). The practice hour remains</w:t>
+        <w:rPr>
+          <w:b/>
+          <w:bCs/>
+        </w:rPr>
+        <w:t xml:space="preserve">A</w:t>
       </w:r>
       <w:r>
         <w:t xml:space="preserve"> </w:t>
       </w:r>
       <w:r>
-        <w:t xml:space="preserve">formally part of the lecture allocation; no separate laboratory credit is claimed.</w:t>
+        <w:t xml:space="preserve">develops the theory;</w:t>
+      </w:r>
+      <w:r>
+        <w:t xml:space="preserve"> </w:t>
+      </w:r>
+      <w:r>
+        <w:t xml:space="preserve">session</w:t>
+      </w:r>
+      <w:r>
+        <w:t xml:space="preserve"> </w:t>
+      </w:r>
+      <w:r>
+        <w:rPr>
+          <w:b/>
+          <w:bCs/>
+        </w:rPr>
+        <w:t xml:space="preserve">B</w:t>
+      </w:r>
+      <w:r>
+        <w:t xml:space="preserve"> </w:t>
+      </w:r>
+      <w:r>
+        <w:t xml:space="preserve">implements the same idea in ROS 2, in a computer-equipped classroom (or on</w:t>
+      </w:r>
+      <w:r>
+        <w:t xml:space="preserve"> </w:t>
+      </w:r>
+      <w:r>
+        <w:t xml:space="preserve">student laptops). Session B remains formally part of the lecture allocation; no separate</w:t>
+      </w:r>
+      <w:r>
+        <w:t xml:space="preserve"> </w:t>
+      </w:r>
+      <w:r>
+        <w:t xml:space="preserve">laboratory credit is claimed.</w:t>
       </w:r>
     </w:p>
     <w:bookmarkEnd w:id="10"/>
@@ -829,7 +867,7 @@
           <w:i/>
           <w:iCs/>
         </w:rPr>
-        <w:t xml:space="preserve">LMS support (recorded ROS 2 walkthroughs, course code repository, auto-graded exercises)</w:t>
+        <w:t xml:space="preserve">Two 1.5-hour sessions per week for 15 weeks = 45 contact hours. LMS support (recorded</w:t>
       </w:r>
       <w:r>
         <w:rPr>
@@ -843,7 +881,21 @@
           <w:i/>
           <w:iCs/>
         </w:rPr>
-        <w:t xml:space="preserve">supplements the classroom but carries no separate contact-hour allocation.</w:t>
+        <w:t xml:space="preserve">ROS 2 walkthroughs, course code repository, auto-graded exercises) supplements the classroom</w:t>
+      </w:r>
+      <w:r>
+        <w:rPr>
+          <w:i/>
+          <w:iCs/>
+        </w:rPr>
+        <w:t xml:space="preserve"> </w:t>
+      </w:r>
+      <w:r>
+        <w:rPr>
+          <w:i/>
+          <w:iCs/>
+        </w:rPr>
+        <w:t xml:space="preserve">but carries no separate contact-hour allocation.</w:t>
       </w:r>
     </w:p>
     <w:bookmarkEnd w:id="16"/>
@@ -1808,13 +1860,13 @@
         <w:t xml:space="preserve">C. Course Content — 11 Technical Weeks + 4 Assessment/Project Weeks</w:t>
       </w:r>
     </w:p>
-    <w:bookmarkStart w:id="20" w:name="Xdc7c87ec85469ff9afa1bb562ff4ec2dbcf2bb5"/>
+    <w:bookmarkStart w:id="20" w:name="X0aa3548f88558142a6945eec82a7c85ea9980b0"/>
     <w:p>
       <w:pPr>
         <w:pStyle w:val="Heading3"/>
       </w:pPr>
       <w:r>
-        <w:t xml:space="preserve">C.1 Weekly Plan (3 hours per week: 2 h lecture + 1 h in-class ROS 2 practice)</w:t>
+        <w:t xml:space="preserve">C.1 Weekly Plan (two 1.5-hour sessions per week)</w:t>
       </w:r>
     </w:p>
     <w:tbl>
@@ -1852,18 +1904,18 @@
               <w:pStyle w:val="Compact"/>
             </w:pPr>
             <w:r>
-              <w:t xml:space="preserve">Lecture topic (theory)</w:t>
-            </w:r>
-          </w:p>
-        </w:tc>
-        <w:tc>
-          <w:tcPr/>
-          <w:p>
-            <w:pPr>
-              <w:pStyle w:val="Compact"/>
-            </w:pPr>
-            <w:r>
-              <w:t xml:space="preserve">In-class ROS 2 practice</w:t>
+              <w:t xml:space="preserve">Session A — theory (1.5 h)</w:t>
+            </w:r>
+          </w:p>
+        </w:tc>
+        <w:tc>
+          <w:tcPr/>
+          <w:p>
+            <w:pPr>
+              <w:pStyle w:val="Compact"/>
+            </w:pPr>
+            <w:r>
+              <w:t xml:space="preserve">Session B — ROS 2 (1.5 h)</w:t>
             </w:r>
           </w:p>
         </w:tc>
@@ -5174,7 +5226,7 @@
               <w:t xml:space="preserve">3 (3-0-0)</w:t>
             </w:r>
             <w:r>
-              <w:t xml:space="preserve">, with 1 of the 3 weekly hours run as in-class ROS 2 practice</w:t>
+              <w:t xml:space="preserve">, with the second of the two weekly sessions run as in-class ROS 2 practice</w:t>
             </w:r>
           </w:p>
         </w:tc>

</xml_diff>

<commit_message>
Operative deck redesign plan; new standing rules; Bug 0 into Week 6
- docs/2026-08-22-2230-deck-redesign-plan.md supersedes the priority
  lists in both reviews. Triaged against a Week 1 starting 23 August:
  T-0 (setup guide, domain IDs, four W01A insertions), T+1 (notes
  mechanism, five macros, W01B pilot rewrite), rolling cadence at ~18 h
  per week of material, retrofit deferred except W07A.
- Standing rules replaced: 12 rules covering format (25-word bodies,
  40-60 slides, per-line code reveal, real screenshots) and flow
  (escalating problem statement, analogy before formalism, numbered
  procedures, demo-first B sessions, pain-first for mathematics).
- Specification: topic 4 renamed 'Sensors, perception and reactive
  navigation'; Week 6B now ends on Bug 0 failing in a U-shaped trap, so
  that SLAM in Week 10 answers a failure the students watched happen.
  Hours and CLOs unchanged.

Co-Authored-By: Claude Opus 5 (1M context) <noreply@anthropic.com>
</commit_message>
<xml_diff>
--- a/01-course-specification/ee414-course-specification-fall2026.docx
+++ b/01-course-specification/ee414-course-specification-fall2026.docx
@@ -2330,7 +2330,7 @@
               <w:pStyle w:val="Compact"/>
             </w:pPr>
             <w:r>
-              <w:t xml:space="preserve">Sensors and actuators; LiDAR principles, noise and range models</w:t>
+              <w:t xml:space="preserve">Sensors and actuators; LiDAR principles, noise and range models; commercial hardware</w:t>
             </w:r>
           </w:p>
         </w:tc>
@@ -2350,7 +2350,17 @@
               <w:t xml:space="preserve"> </w:t>
             </w:r>
             <w:r>
-              <w:t xml:space="preserve">processing, reactive obstacle avoidance, wall following</w:t>
+              <w:t xml:space="preserve">processing, wall following,</w:t>
+            </w:r>
+            <w:r>
+              <w:t xml:space="preserve"> </w:t>
+            </w:r>
+            <w:r>
+              <w:rPr>
+                <w:b/>
+                <w:bCs/>
+              </w:rPr>
+              <w:t xml:space="preserve">Bug 0 — and watching it fail in a U-shaped trap</w:t>
             </w:r>
           </w:p>
         </w:tc>
@@ -3198,7 +3208,7 @@
               <w:pStyle w:val="Compact"/>
             </w:pPr>
             <w:r>
-              <w:t xml:space="preserve">Sensors, perception and obstacle avoidance</w:t>
+              <w:t xml:space="preserve">Sensors, perception and reactive navigation</w:t>
             </w:r>
           </w:p>
         </w:tc>

</xml_diff>